<commit_message>
Urban Ground Truth Data (#23)
* feat: add urbanGroundTruthData.mat and its labeling session
* doc: add first weekly report
</commit_message>
<xml_diff>
--- a/weekly_reports/ADAS_Project_Report_LDW_DP01.docx
+++ b/weekly_reports/ADAS_Project_Report_LDW_DP01.docx
@@ -205,13 +205,7 @@
               <w:t>Asal Sanei, Amirhossein Mohammadi</w:t>
             </w:r>
             <w:r>
-              <w:t xml:space="preserve">, </w:t>
-            </w:r>
-            <w:r>
-              <w:t>Fatemeh Javaherat,</w:t>
-            </w:r>
-            <w:r>
-              <w:t xml:space="preserve"> Kourosh Karimi</w:t>
+              <w:t>, Fatemeh Javaherat, Kourosh Karimi</w:t>
             </w:r>
           </w:p>
         </w:tc>
@@ -496,15 +490,7 @@
           <w:b w:val="0"/>
           <w:bCs w:val="0"/>
         </w:rPr>
-        <w:t xml:space="preserve"> (</w:t>
-      </w:r>
-      <w:r>
-        <w:rPr>
-          <w:rStyle w:val="Strong"/>
-          <w:b w:val="0"/>
-          <w:bCs w:val="0"/>
-        </w:rPr>
-        <w:t>ROI</w:t>
+        <w:t xml:space="preserve"> (ROI</w:t>
       </w:r>
       <w:r>
         <w:rPr>
@@ -552,15 +538,7 @@
           <w:b w:val="0"/>
           <w:bCs w:val="0"/>
         </w:rPr>
-        <w:t>Hough Transform</w:t>
-      </w:r>
-      <w:r>
-        <w:rPr>
-          <w:rStyle w:val="Strong"/>
-          <w:b w:val="0"/>
-          <w:bCs w:val="0"/>
-        </w:rPr>
-        <w:t>)</w:t>
+        <w:t>Hough Transform)</w:t>
       </w:r>
       <w:r>
         <w:rPr>
@@ -649,8 +627,8 @@
       <w:bookmarkEnd w:id="10"/>
       <w:bookmarkEnd w:id="11"/>
     </w:p>
-    <w:bookmarkStart w:id="12" w:name="_Toc228722654" w:displacedByCustomXml="next"/>
-    <w:bookmarkStart w:id="13" w:name="_Toc228722718" w:displacedByCustomXml="next"/>
+    <w:bookmarkStart w:id="12" w:name="_Toc228722718" w:displacedByCustomXml="next"/>
+    <w:bookmarkStart w:id="13" w:name="_Toc228722654" w:displacedByCustomXml="next"/>
     <w:sdt>
       <w:sdtPr>
         <w:rPr>

</xml_diff>